<commit_message>
Actualizar Reporte Técnico: evidencia Git, participación y correcciones de forma
Corrige la arquitectura de planeación, la tabla de evidencia Git (autores con nombre, commits de todos los integrantes), la participación individual, la versión 2.1 y el apartado de problemas encontrados. Agrega captura de comparación de escenarios.
</commit_message>
<xml_diff>
--- a/reporte_tecnico/Reporte_Tecnico_Equipo04.docx
+++ b/reporte_tecnico/Reporte_Tecnico_Equipo04.docx
@@ -261,7 +261,7 @@
           <w:sz w:val="24"/>
           <w:szCs w:val="24"/>
         </w:rPr>
-        <w:t>Septiembre</w:t>
+        <w:t>septiembre</w:t>
       </w:r>
       <w:proofErr w:type="gramEnd"/>
       <w:r>
@@ -796,7 +796,7 @@
                 <w:sz w:val="18"/>
                 <w:szCs w:val="18"/>
               </w:rPr>
-              <w:t>Análisis del problema, propuesta, presentación, integración del repositorio</w:t>
+              <w:t xml:space="preserve">Análisis del problema, propuesta, presentación, modelo de datos y sistema web mínimo, integración del repositorio e integración del módulo de planeación</w:t>
             </w:r>
           </w:p>
         </w:tc>
@@ -866,7 +866,7 @@
                 <w:sz w:val="18"/>
                 <w:szCs w:val="18"/>
               </w:rPr>
-              <w:t>Módulos CRUD (productos, catálogos), modo local, script de base de datos de planeación</w:t>
+              <w:t xml:space="preserve">Módulos CRUD (productos, catálogos), modo local y primera versión del módulo de planeación (código, pruebas y migración)</w:t>
             </w:r>
           </w:p>
         </w:tc>
@@ -1004,7 +1004,7 @@
                 <w:sz w:val="18"/>
                 <w:szCs w:val="18"/>
               </w:rPr>
-              <w:t>Desarrollo y documentación de los bloques A y B, elaboración de requerimientos y apoyo en pruebas y presentación</w:t>
+              <w:t xml:space="preserve">Desarrollo y documentación de los bloques A y B, revisión e integración de los requerimientos, organización del repositorio y apoyo en pruebas y presentación</w:t>
             </w:r>
           </w:p>
         </w:tc>
@@ -1073,7 +1073,7 @@
                 <w:sz w:val="18"/>
                 <w:szCs w:val="18"/>
               </w:rPr>
-              <w:t>Elaboración de casos de uso, historias de usuario y criterios de aceptación del sistema</w:t>
+              <w:t xml:space="preserve">Elaboración de los requerimientos funcionales y no funcionales, historias de usuario con criterios de aceptación, reglas de negocio, casos de uso y matriz de trazabilidad (bloque B)</w:t>
             </w:r>
           </w:p>
         </w:tc>
@@ -1963,7 +1963,7 @@
                 <w:sz w:val="18"/>
                 <w:szCs w:val="18"/>
               </w:rPr>
-              <w:t>30-sep-2026</w:t>
+              <w:t xml:space="preserve">29-sep-2026</w:t>
             </w:r>
           </w:p>
         </w:tc>
@@ -15452,35 +15452,10 @@
           <w:color w:val="000000"/>
           <w:sz w:val="21"/>
         </w:rPr>
-        <w:t xml:space="preserve">La solución es un monolito modular en Flask: una sola aplicación desplegable cuyo código se separa por módulos (app.py, rutas.py, nucleo.py, productos_crud.py, catalogos_crud.py y </w:t>
-      </w:r>
-      <w:r>
-        <w:rPr>
-          <w:rFonts w:ascii="Arial" w:hAnsi="Arial"/>
-          <w:color w:val="000000"/>
-          <w:sz w:val="21"/>
-        </w:rPr>
-        <w:lastRenderedPageBreak/>
-        <w:t xml:space="preserve">planeacion.py). Las reglas de integridad viven en PostgreSQL como restricciones, funciones y </w:t>
+        <w:t xml:space="preserve">La solución es un monolito modular en Flask: una sola aplicación desplegable cuyo código se separa por módulos (app.py, rutas.py, nucleo.py, productos_crud.py, catalogos_crud.py, planeacion.py, planeacion_calc.py y planeacion_demo.py). Las reglas de integridad viven en PostgreSQL como restricciones, funciones y triggers; la aplicación abre las transacciones y traduce los errores para la interfaz.</w:t>
       </w:r>
       <w:proofErr w:type="spellStart"/>
-      <w:r>
-        <w:rPr>
-          <w:rFonts w:ascii="Arial" w:hAnsi="Arial"/>
-          <w:color w:val="000000"/>
-          <w:sz w:val="21"/>
-        </w:rPr>
-        <w:t>triggers</w:t>
-      </w:r>
       <w:proofErr w:type="spellEnd"/>
-      <w:r>
-        <w:rPr>
-          <w:rFonts w:ascii="Arial" w:hAnsi="Arial"/>
-          <w:color w:val="000000"/>
-          <w:sz w:val="21"/>
-        </w:rPr>
-        <w:t>; la aplicación abre las transacciones y traduce los errores para la interfaz.</w:t>
-      </w:r>
     </w:p>
     <w:tbl>
       <w:tblPr>
@@ -16173,44 +16148,12 @@
           <w:color w:val="000000"/>
           <w:sz w:val="21"/>
         </w:rPr>
-        <w:t xml:space="preserve">planeacion.py reúne el </w:t>
+        <w:t xml:space="preserve">planeacion_calc.py contiene los cálculos como funciones puras y deterministas, sin depender de Flask ni de la base de datos, por lo que se prueban de forma aislada. planeacion.py reúne el blueprint y las consultas; planeacion_demo.py aporta los datos del modo local; las pantallas son las plantillas plan_*.html y panel_*.html. app.py registra el blueprint y nucleo.py concentra configuración, permisos y acceso a datos.</w:t>
       </w:r>
       <w:proofErr w:type="spellStart"/>
-      <w:r>
-        <w:rPr>
-          <w:rFonts w:ascii="Arial" w:hAnsi="Arial"/>
-          <w:color w:val="000000"/>
-          <w:sz w:val="21"/>
-        </w:rPr>
-        <w:t>blueprint</w:t>
-      </w:r>
       <w:proofErr w:type="spellEnd"/>
-      <w:r>
-        <w:rPr>
-          <w:rFonts w:ascii="Arial" w:hAnsi="Arial"/>
-          <w:color w:val="000000"/>
-          <w:sz w:val="21"/>
-        </w:rPr>
-        <w:t xml:space="preserve">, las consultas y las funciones cuantitativas de esta versión. Los cálculos son funciones deterministas que reciben valores y devuelven estructuras, por lo que pueden probarse sin depender de la interfaz. app.py registra el </w:t>
-      </w:r>
       <w:proofErr w:type="spellStart"/>
-      <w:r>
-        <w:rPr>
-          <w:rFonts w:ascii="Arial" w:hAnsi="Arial"/>
-          <w:color w:val="000000"/>
-          <w:sz w:val="21"/>
-        </w:rPr>
-        <w:t>blueprint</w:t>
-      </w:r>
       <w:proofErr w:type="spellEnd"/>
-      <w:r>
-        <w:rPr>
-          <w:rFonts w:ascii="Arial" w:hAnsi="Arial"/>
-          <w:color w:val="000000"/>
-          <w:sz w:val="21"/>
-        </w:rPr>
-        <w:t>, nucleo.py concentra configuración, permisos y acceso a datos, y planeacion.html presenta los resultados.</w:t>
-      </w:r>
     </w:p>
     <w:p>
       <w:pPr>
@@ -20561,7 +20504,7 @@
         </w:rPr>
         <w:drawing>
           <wp:inline distT="0" distB="0" distL="0" distR="0" wp14:anchorId="221DAAA0" wp14:editId="672782EE">
-            <wp:extent cx="5394960" cy="3154774"/>
+            <wp:extent cx="5394960" cy="5128359"/>
             <wp:effectExtent l="0" t="0" r="0" b="0"/>
             <wp:docPr id="19" name="Picture 19"/>
             <wp:cNvGraphicFramePr>
@@ -20583,7 +20526,7 @@
                   <pic:spPr>
                     <a:xfrm>
                       <a:off x="0" y="0"/>
-                      <a:ext cx="5394960" cy="3154774"/>
+                      <a:ext cx="5394960" cy="5128359"/>
                     </a:xfrm>
                     <a:prstGeom prst="rect">
                       <a:avLst/>
@@ -20622,7 +20565,7 @@
           <w:color w:val="000000"/>
           <w:sz w:val="18"/>
         </w:rPr>
-        <w:t>Pantalla para comparar y exportar simulaciones. Aún no hay escenarios guardados y se solicitan al menos dos para comparar.</w:t>
+        <w:t xml:space="preserve">Comparación de dos escenarios guardados (modo local con datos de demostración): decisión, equilibrio, utilización y costo por pedido lado a lado, con exportación a CSV.</w:t>
       </w:r>
     </w:p>
     <w:p>
@@ -21926,7 +21869,7 @@
                 <w:sz w:val="18"/>
                 <w:szCs w:val="18"/>
               </w:rPr>
-              <w:t>El módulo descrito en un manual previo no existía en el repositorio</w:t>
+              <w:t xml:space="preserve">Al iniciar la integración, el repositorio solo contenía el script SQL del módulo de planeación</w:t>
             </w:r>
           </w:p>
         </w:tc>
@@ -22288,7 +22231,7 @@
                 <w:sz w:val="18"/>
                 <w:szCs w:val="18"/>
               </w:rPr>
-              <w:t>Dos implementaciones paralelas de Planeación (la de Vanessa y la de esta rama) con nombres de archivo iguales</w:t>
+              <w:t xml:space="preserve">Dos versiones del módulo de Planeación con nombres de archivo iguales</w:t>
             </w:r>
           </w:p>
         </w:tc>
@@ -22316,7 +22259,7 @@
                 <w:sz w:val="18"/>
                 <w:szCs w:val="18"/>
               </w:rPr>
-              <w:t>Trabajo simultáneo sin coordinar</w:t>
+              <w:t xml:space="preserve">Desarrollo en paralelo</w:t>
             </w:r>
           </w:p>
         </w:tc>
@@ -22344,26 +22287,10 @@
                 <w:sz w:val="18"/>
                 <w:szCs w:val="18"/>
               </w:rPr>
-              <w:t xml:space="preserve">Fusión en una rama: base de 8 módulos más el modo local de la otra; se retiran base.html y planeacion.html, que estaban fuera de </w:t>
+              <w:t xml:space="preserve">Integración en el Pull Request #1: base de 8 módulos más el modo local de la otra versión; se retiran base.html y planeacion.html, que estaban fuera de templates/</w:t>
             </w:r>
             <w:proofErr w:type="spellStart"/>
-            <w:r>
-              <w:rPr>
-                <w:color w:val="1B241F"/>
-                <w:sz w:val="18"/>
-                <w:szCs w:val="18"/>
-              </w:rPr>
-              <w:t>templates</w:t>
-            </w:r>
             <w:proofErr w:type="spellEnd"/>
-            <w:r>
-              <w:rPr>
-                <w:color w:val="1B241F"/>
-                <w:sz w:val="18"/>
-                <w:szCs w:val="18"/>
-              </w:rPr>
-              <w:t>/</w:t>
-            </w:r>
           </w:p>
         </w:tc>
       </w:tr>
@@ -22392,7 +22319,7 @@
                 <w:sz w:val="18"/>
                 <w:szCs w:val="18"/>
               </w:rPr>
-              <w:t>La versión subida de Planeación no arrancaba en Docker</w:t>
+              <w:t>La versión inicial de Planeación no arrancaba en Docker</w:t>
             </w:r>
           </w:p>
         </w:tc>
@@ -23190,7 +23117,7 @@
                 <w:sz w:val="18"/>
                 <w:szCs w:val="18"/>
               </w:rPr>
-              <w:t>14</w:t>
+              <w:t xml:space="preserve">15</w:t>
             </w:r>
           </w:p>
         </w:tc>
@@ -23243,24 +23170,10 @@
                 <w:sz w:val="18"/>
                 <w:szCs w:val="18"/>
               </w:rPr>
-              <w:t xml:space="preserve">Participó en los bloques A y B, realizando el análisis del problema, la propuesta de </w:t>
+              <w:t xml:space="preserve">Participó en los bloques A y B: análisis del problema, propuesta de microhubs, matriz de perfiles y permisos, y documentación general del proyecto. Subió y organizó los documentos en el repositorio y colaboró en la revisión e integración de los requerimientos, casos de uso, historias de usuario y matriz de trazabilidad elaborados por Jorge.</w:t>
             </w:r>
             <w:proofErr w:type="spellStart"/>
-            <w:r>
-              <w:rPr>
-                <w:sz w:val="18"/>
-                <w:szCs w:val="18"/>
-              </w:rPr>
-              <w:t>microhubs</w:t>
-            </w:r>
             <w:proofErr w:type="spellEnd"/>
-            <w:r>
-              <w:rPr>
-                <w:sz w:val="18"/>
-                <w:szCs w:val="18"/>
-              </w:rPr>
-              <w:t>, la matriz de perfiles y permisos, así como los requerimientos, casos de uso, historias de usuario, matriz de trazabilidad y documentación general del proyecto.</w:t>
-            </w:r>
           </w:p>
         </w:tc>
       </w:tr>
@@ -23317,7 +23230,7 @@
                 <w:sz w:val="18"/>
                 <w:szCs w:val="18"/>
               </w:rPr>
-              <w:t>8</w:t>
+              <w:t xml:space="preserve">10</w:t>
             </w:r>
           </w:p>
         </w:tc>
@@ -23380,15 +23293,7 @@
                 <w:sz w:val="18"/>
                 <w:szCs w:val="18"/>
               </w:rPr>
-              <w:t xml:space="preserve">Participó en el diseño de la solución, desarrollo del modelo de datos y estructura general del sistema web, además de </w:t>
-            </w:r>
-            <w:r>
-              <w:rPr>
-                <w:sz w:val="18"/>
-                <w:szCs w:val="18"/>
-              </w:rPr>
-              <w:lastRenderedPageBreak/>
-              <w:t>apoyar en la presentación y documentación.</w:t>
+              <w:t xml:space="preserve">Participó en el diseño de la solución, desarrollo del modelo de datos y estructura general del sistema web, además de apoyar en la presentación y documentación. En esta entrega integró y publicó el módulo de planeación (Pull Request #1) y consolidó el Reporte Técnico.</w:t>
             </w:r>
           </w:p>
         </w:tc>
@@ -23465,7 +23370,7 @@
                 <w:sz w:val="18"/>
                 <w:szCs w:val="18"/>
               </w:rPr>
-              <w:t>4</w:t>
+              <w:t xml:space="preserve">5</w:t>
             </w:r>
           </w:p>
         </w:tc>
@@ -23612,7 +23517,7 @@
                 <w:sz w:val="18"/>
                 <w:szCs w:val="18"/>
               </w:rPr>
-              <w:t>2</w:t>
+              <w:t xml:space="preserve">5</w:t>
             </w:r>
           </w:p>
         </w:tc>
@@ -23794,7 +23699,7 @@
                 <w:sz w:val="18"/>
                 <w:szCs w:val="18"/>
               </w:rPr>
-              <w:t>Participó en el análisis de requerimientos mediante la elaboración de los casos de uso y las historias de usuario del sistema.</w:t>
+              <w:t xml:space="preserve">Elaboró los requerimientos funcionales y no funcionales, las historias de usuario con criterios de aceptación, las reglas de negocio, los casos de uso y la matriz de trazabilidad (bloque B), que son la base documental del proyecto.</w:t>
             </w:r>
           </w:p>
         </w:tc>
@@ -23819,40 +23724,16 @@
         <w:spacing w:after="120"/>
       </w:pPr>
       <w:r>
-        <w:t xml:space="preserve">Repositorio: https://github.com/mauro-castp/proyecto-integracion · rama </w:t>
+        <w:t xml:space="preserve">Repositorio: https://github.com/mauro-castp/proyecto-integracion · rama main con 35 commits al 29 de septiembre de 2026. El módulo de planeación se integró mediante el Pull Request #1 (rama feature/planeacion-integrada), fusionado a main.</w:t>
       </w:r>
       <w:proofErr w:type="spellStart"/>
-      <w:r>
-        <w:t>main</w:t>
-      </w:r>
       <w:proofErr w:type="spellEnd"/>
-      <w:r>
-        <w:t xml:space="preserve"> con 28 </w:t>
-      </w:r>
       <w:proofErr w:type="spellStart"/>
-      <w:r>
-        <w:t>commits</w:t>
-      </w:r>
       <w:proofErr w:type="spellEnd"/>
-      <w:r>
-        <w:t xml:space="preserve"> al 29 de septiembre de 2026; el trabajo de esta entrega está en la rama </w:t>
-      </w:r>
       <w:proofErr w:type="spellStart"/>
-      <w:r>
-        <w:t>feature</w:t>
-      </w:r>
       <w:proofErr w:type="spellEnd"/>
-      <w:r>
-        <w:t>/</w:t>
-      </w:r>
       <w:proofErr w:type="spellStart"/>
-      <w:r>
-        <w:t>planeacion</w:t>
-      </w:r>
       <w:proofErr w:type="spellEnd"/>
-      <w:r>
-        <w:t>-integrada</w:t>
-      </w:r>
     </w:p>
     <w:tbl>
       <w:tblPr>
@@ -24058,7 +23939,7 @@
                 <w:sz w:val="18"/>
                 <w:szCs w:val="18"/>
               </w:rPr>
-              <w:t>vanessamorante-lgtm</w:t>
+              <w:t xml:space="preserve">Vanessa Morante (vanessamorante-lgtm)</w:t>
             </w:r>
             <w:proofErr w:type="spellEnd"/>
           </w:p>
@@ -24210,7 +24091,7 @@
                 <w:sz w:val="18"/>
                 <w:szCs w:val="18"/>
               </w:rPr>
-              <w:t>vanessamorante-lgtm</w:t>
+              <w:t xml:space="preserve">Vanessa Morante (vanessamorante-lgtm)</w:t>
             </w:r>
             <w:proofErr w:type="spellEnd"/>
           </w:p>
@@ -24362,7 +24243,7 @@
                 <w:sz w:val="18"/>
                 <w:szCs w:val="18"/>
               </w:rPr>
-              <w:t>vanessamorante-lgtm</w:t>
+              <w:t xml:space="preserve">Vanessa Morante (vanessamorante-lgtm)</w:t>
             </w:r>
             <w:proofErr w:type="spellEnd"/>
           </w:p>
@@ -24506,7 +24387,7 @@
                 <w:sz w:val="18"/>
                 <w:szCs w:val="18"/>
               </w:rPr>
-              <w:t>vanessamorante-lgtm</w:t>
+              <w:t xml:space="preserve">Vanessa Morante (vanessamorante-lgtm)</w:t>
             </w:r>
             <w:proofErr w:type="spellEnd"/>
           </w:p>
@@ -25012,7 +24893,7 @@
                 <w:sz w:val="18"/>
                 <w:szCs w:val="18"/>
               </w:rPr>
-              <w:t>mau</w:t>
+              <w:t xml:space="preserve">Mauro Castillo (mau)</w:t>
             </w:r>
             <w:proofErr w:type="spellEnd"/>
           </w:p>
@@ -25255,6 +25136,972 @@
                 <w:sz w:val="18"/>
                 <w:szCs w:val="18"/>
               </w:rPr>
+              <w:t xml:space="preserve">d9ccbe7</w:t>
+            </w:r>
+          </w:p>
+        </w:tc>
+        <w:tc>
+          <w:tcPr>
+            <w:tcW w:w="2400" w:type="dxa"/>
+            <w:tcBorders>
+              <w:top w:val="single" w:sz="4" w:space="0" w:color="BFC5C0"/>
+              <w:left w:val="single" w:sz="4" w:space="0" w:color="BFC5C0"/>
+              <w:bottom w:val="single" w:sz="4" w:space="0" w:color="BFC5C0"/>
+              <w:right w:val="single" w:sz="4" w:space="0" w:color="BFC5C0"/>
+            </w:tcBorders>
+            <w:shd w:val="clear" w:color="auto" w:fill="FFFFFF"/>
+            <w:tcMar>
+              <w:top w:w="60" w:type="dxa"/>
+              <w:left w:w="100" w:type="dxa"/>
+              <w:bottom w:w="60" w:type="dxa"/>
+              <w:right w:w="100" w:type="dxa"/>
+            </w:tcMar>
+          </w:tcPr>
+          <w:p>
+            <w:pPr>
+              <w:rPr>
+                <w:sz w:val="18"/>
+                <w:szCs w:val="18"/>
+              </w:rPr>
+            </w:pPr>
+            <w:r>
+              <w:rPr>
+                <w:color w:val="1B241F"/>
+                <w:sz w:val="18"/>
+                <w:szCs w:val="18"/>
+              </w:rPr>
+              <w:t xml:space="preserve">María José Cedillo (mariacedillom-tech)</w:t>
+            </w:r>
+          </w:p>
+        </w:tc>
+        <w:tc>
+          <w:tcPr>
+            <w:tcW w:w="1000" w:type="dxa"/>
+            <w:tcBorders>
+              <w:top w:val="single" w:sz="4" w:space="0" w:color="BFC5C0"/>
+              <w:left w:val="single" w:sz="4" w:space="0" w:color="BFC5C0"/>
+              <w:bottom w:val="single" w:sz="4" w:space="0" w:color="BFC5C0"/>
+              <w:right w:val="single" w:sz="4" w:space="0" w:color="BFC5C0"/>
+            </w:tcBorders>
+            <w:shd w:val="clear" w:color="auto" w:fill="FFFFFF"/>
+            <w:tcMar>
+              <w:top w:w="60" w:type="dxa"/>
+              <w:left w:w="100" w:type="dxa"/>
+              <w:bottom w:w="60" w:type="dxa"/>
+              <w:right w:w="100" w:type="dxa"/>
+            </w:tcMar>
+          </w:tcPr>
+          <w:p>
+            <w:pPr>
+              <w:rPr>
+                <w:sz w:val="18"/>
+                <w:szCs w:val="18"/>
+              </w:rPr>
+            </w:pPr>
+            <w:r>
+              <w:rPr>
+                <w:color w:val="1B241F"/>
+                <w:sz w:val="18"/>
+                <w:szCs w:val="18"/>
+              </w:rPr>
+              <w:t xml:space="preserve">01-sep</w:t>
+            </w:r>
+          </w:p>
+        </w:tc>
+        <w:tc>
+          <w:tcPr>
+            <w:tcW w:w="4860" w:type="dxa"/>
+            <w:tcBorders>
+              <w:top w:val="single" w:sz="4" w:space="0" w:color="BFC5C0"/>
+              <w:left w:val="single" w:sz="4" w:space="0" w:color="BFC5C0"/>
+              <w:bottom w:val="single" w:sz="4" w:space="0" w:color="BFC5C0"/>
+              <w:right w:val="single" w:sz="4" w:space="0" w:color="BFC5C0"/>
+            </w:tcBorders>
+            <w:shd w:val="clear" w:color="auto" w:fill="FFFFFF"/>
+            <w:tcMar>
+              <w:top w:w="60" w:type="dxa"/>
+              <w:left w:w="100" w:type="dxa"/>
+              <w:bottom w:w="60" w:type="dxa"/>
+              <w:right w:w="100" w:type="dxa"/>
+            </w:tcMar>
+          </w:tcPr>
+          <w:p>
+            <w:pPr>
+              <w:rPr>
+                <w:sz w:val="18"/>
+                <w:szCs w:val="18"/>
+              </w:rPr>
+            </w:pPr>
+            <w:r>
+              <w:rPr>
+                <w:color w:val="1B241F"/>
+                <w:sz w:val="18"/>
+                <w:szCs w:val="18"/>
+              </w:rPr>
+              <w:t xml:space="preserve">Add files via upload (Análisis del problema)</w:t>
+            </w:r>
+          </w:p>
+        </w:tc>
+      </w:tr>
+      <w:tr>
+        <w:tc>
+          <w:tcPr>
+            <w:tcW w:w="1100" w:type="dxa"/>
+            <w:tcBorders>
+              <w:top w:val="single" w:sz="4" w:space="0" w:color="BFC5C0"/>
+              <w:left w:val="single" w:sz="4" w:space="0" w:color="BFC5C0"/>
+              <w:bottom w:val="single" w:sz="4" w:space="0" w:color="BFC5C0"/>
+              <w:right w:val="single" w:sz="4" w:space="0" w:color="BFC5C0"/>
+            </w:tcBorders>
+            <w:shd w:val="clear" w:color="auto" w:fill="FFFFFF"/>
+            <w:tcMar>
+              <w:top w:w="60" w:type="dxa"/>
+              <w:left w:w="100" w:type="dxa"/>
+              <w:bottom w:w="60" w:type="dxa"/>
+              <w:right w:w="100" w:type="dxa"/>
+            </w:tcMar>
+          </w:tcPr>
+          <w:p>
+            <w:pPr>
+              <w:rPr>
+                <w:sz w:val="18"/>
+                <w:szCs w:val="18"/>
+              </w:rPr>
+            </w:pPr>
+            <w:r>
+              <w:rPr>
+                <w:color w:val="1B241F"/>
+                <w:sz w:val="18"/>
+                <w:szCs w:val="18"/>
+              </w:rPr>
+              <w:t xml:space="preserve">8d2bc6c</w:t>
+            </w:r>
+          </w:p>
+        </w:tc>
+        <w:tc>
+          <w:tcPr>
+            <w:tcW w:w="2400" w:type="dxa"/>
+            <w:tcBorders>
+              <w:top w:val="single" w:sz="4" w:space="0" w:color="BFC5C0"/>
+              <w:left w:val="single" w:sz="4" w:space="0" w:color="BFC5C0"/>
+              <w:bottom w:val="single" w:sz="4" w:space="0" w:color="BFC5C0"/>
+              <w:right w:val="single" w:sz="4" w:space="0" w:color="BFC5C0"/>
+            </w:tcBorders>
+            <w:shd w:val="clear" w:color="auto" w:fill="FFFFFF"/>
+            <w:tcMar>
+              <w:top w:w="60" w:type="dxa"/>
+              <w:left w:w="100" w:type="dxa"/>
+              <w:bottom w:w="60" w:type="dxa"/>
+              <w:right w:w="100" w:type="dxa"/>
+            </w:tcMar>
+          </w:tcPr>
+          <w:p>
+            <w:pPr>
+              <w:rPr>
+                <w:sz w:val="18"/>
+                <w:szCs w:val="18"/>
+              </w:rPr>
+            </w:pPr>
+            <w:r>
+              <w:rPr>
+                <w:color w:val="1B241F"/>
+                <w:sz w:val="18"/>
+                <w:szCs w:val="18"/>
+              </w:rPr>
+              <w:t xml:space="preserve">María José Cedillo (mariacedillom-tech)</w:t>
+            </w:r>
+          </w:p>
+        </w:tc>
+        <w:tc>
+          <w:tcPr>
+            <w:tcW w:w="1000" w:type="dxa"/>
+            <w:tcBorders>
+              <w:top w:val="single" w:sz="4" w:space="0" w:color="BFC5C0"/>
+              <w:left w:val="single" w:sz="4" w:space="0" w:color="BFC5C0"/>
+              <w:bottom w:val="single" w:sz="4" w:space="0" w:color="BFC5C0"/>
+              <w:right w:val="single" w:sz="4" w:space="0" w:color="BFC5C0"/>
+            </w:tcBorders>
+            <w:shd w:val="clear" w:color="auto" w:fill="FFFFFF"/>
+            <w:tcMar>
+              <w:top w:w="60" w:type="dxa"/>
+              <w:left w:w="100" w:type="dxa"/>
+              <w:bottom w:w="60" w:type="dxa"/>
+              <w:right w:w="100" w:type="dxa"/>
+            </w:tcMar>
+          </w:tcPr>
+          <w:p>
+            <w:pPr>
+              <w:rPr>
+                <w:sz w:val="18"/>
+                <w:szCs w:val="18"/>
+              </w:rPr>
+            </w:pPr>
+            <w:r>
+              <w:rPr>
+                <w:color w:val="1B241F"/>
+                <w:sz w:val="18"/>
+                <w:szCs w:val="18"/>
+              </w:rPr>
+              <w:t xml:space="preserve">01-sep</w:t>
+            </w:r>
+          </w:p>
+        </w:tc>
+        <w:tc>
+          <w:tcPr>
+            <w:tcW w:w="4860" w:type="dxa"/>
+            <w:tcBorders>
+              <w:top w:val="single" w:sz="4" w:space="0" w:color="BFC5C0"/>
+              <w:left w:val="single" w:sz="4" w:space="0" w:color="BFC5C0"/>
+              <w:bottom w:val="single" w:sz="4" w:space="0" w:color="BFC5C0"/>
+              <w:right w:val="single" w:sz="4" w:space="0" w:color="BFC5C0"/>
+            </w:tcBorders>
+            <w:shd w:val="clear" w:color="auto" w:fill="FFFFFF"/>
+            <w:tcMar>
+              <w:top w:w="60" w:type="dxa"/>
+              <w:left w:w="100" w:type="dxa"/>
+              <w:bottom w:w="60" w:type="dxa"/>
+              <w:right w:w="100" w:type="dxa"/>
+            </w:tcMar>
+          </w:tcPr>
+          <w:p>
+            <w:pPr>
+              <w:rPr>
+                <w:sz w:val="18"/>
+                <w:szCs w:val="18"/>
+              </w:rPr>
+            </w:pPr>
+            <w:r>
+              <w:rPr>
+                <w:color w:val="1B241F"/>
+                <w:sz w:val="18"/>
+                <w:szCs w:val="18"/>
+              </w:rPr>
+              <w:t xml:space="preserve">Add files via upload (Matriz de perfiles y permisos)</w:t>
+            </w:r>
+          </w:p>
+        </w:tc>
+      </w:tr>
+      <w:tr>
+        <w:tc>
+          <w:tcPr>
+            <w:tcW w:w="1100" w:type="dxa"/>
+            <w:tcBorders>
+              <w:top w:val="single" w:sz="4" w:space="0" w:color="BFC5C0"/>
+              <w:left w:val="single" w:sz="4" w:space="0" w:color="BFC5C0"/>
+              <w:bottom w:val="single" w:sz="4" w:space="0" w:color="BFC5C0"/>
+              <w:right w:val="single" w:sz="4" w:space="0" w:color="BFC5C0"/>
+            </w:tcBorders>
+            <w:shd w:val="clear" w:color="auto" w:fill="FFFFFF"/>
+            <w:tcMar>
+              <w:top w:w="60" w:type="dxa"/>
+              <w:left w:w="100" w:type="dxa"/>
+              <w:bottom w:w="60" w:type="dxa"/>
+              <w:right w:w="100" w:type="dxa"/>
+            </w:tcMar>
+          </w:tcPr>
+          <w:p>
+            <w:pPr>
+              <w:rPr>
+                <w:sz w:val="18"/>
+                <w:szCs w:val="18"/>
+              </w:rPr>
+            </w:pPr>
+            <w:r>
+              <w:rPr>
+                <w:color w:val="1B241F"/>
+                <w:sz w:val="18"/>
+                <w:szCs w:val="18"/>
+              </w:rPr>
+              <w:t xml:space="preserve">1dd8e44</w:t>
+            </w:r>
+          </w:p>
+        </w:tc>
+        <w:tc>
+          <w:tcPr>
+            <w:tcW w:w="2400" w:type="dxa"/>
+            <w:tcBorders>
+              <w:top w:val="single" w:sz="4" w:space="0" w:color="BFC5C0"/>
+              <w:left w:val="single" w:sz="4" w:space="0" w:color="BFC5C0"/>
+              <w:bottom w:val="single" w:sz="4" w:space="0" w:color="BFC5C0"/>
+              <w:right w:val="single" w:sz="4" w:space="0" w:color="BFC5C0"/>
+            </w:tcBorders>
+            <w:shd w:val="clear" w:color="auto" w:fill="FFFFFF"/>
+            <w:tcMar>
+              <w:top w:w="60" w:type="dxa"/>
+              <w:left w:w="100" w:type="dxa"/>
+              <w:bottom w:w="60" w:type="dxa"/>
+              <w:right w:w="100" w:type="dxa"/>
+            </w:tcMar>
+          </w:tcPr>
+          <w:p>
+            <w:pPr>
+              <w:rPr>
+                <w:sz w:val="18"/>
+                <w:szCs w:val="18"/>
+              </w:rPr>
+            </w:pPr>
+            <w:r>
+              <w:rPr>
+                <w:color w:val="1B241F"/>
+                <w:sz w:val="18"/>
+                <w:szCs w:val="18"/>
+              </w:rPr>
+              <w:t xml:space="preserve">María José Cedillo (mariacedillom-tech)</w:t>
+            </w:r>
+          </w:p>
+        </w:tc>
+        <w:tc>
+          <w:tcPr>
+            <w:tcW w:w="1000" w:type="dxa"/>
+            <w:tcBorders>
+              <w:top w:val="single" w:sz="4" w:space="0" w:color="BFC5C0"/>
+              <w:left w:val="single" w:sz="4" w:space="0" w:color="BFC5C0"/>
+              <w:bottom w:val="single" w:sz="4" w:space="0" w:color="BFC5C0"/>
+              <w:right w:val="single" w:sz="4" w:space="0" w:color="BFC5C0"/>
+            </w:tcBorders>
+            <w:shd w:val="clear" w:color="auto" w:fill="FFFFFF"/>
+            <w:tcMar>
+              <w:top w:w="60" w:type="dxa"/>
+              <w:left w:w="100" w:type="dxa"/>
+              <w:bottom w:w="60" w:type="dxa"/>
+              <w:right w:w="100" w:type="dxa"/>
+            </w:tcMar>
+          </w:tcPr>
+          <w:p>
+            <w:pPr>
+              <w:rPr>
+                <w:sz w:val="18"/>
+                <w:szCs w:val="18"/>
+              </w:rPr>
+            </w:pPr>
+            <w:r>
+              <w:rPr>
+                <w:color w:val="1B241F"/>
+                <w:sz w:val="18"/>
+                <w:szCs w:val="18"/>
+              </w:rPr>
+              <w:t xml:space="preserve">01-sep</w:t>
+            </w:r>
+          </w:p>
+        </w:tc>
+        <w:tc>
+          <w:tcPr>
+            <w:tcW w:w="4860" w:type="dxa"/>
+            <w:tcBorders>
+              <w:top w:val="single" w:sz="4" w:space="0" w:color="BFC5C0"/>
+              <w:left w:val="single" w:sz="4" w:space="0" w:color="BFC5C0"/>
+              <w:bottom w:val="single" w:sz="4" w:space="0" w:color="BFC5C0"/>
+              <w:right w:val="single" w:sz="4" w:space="0" w:color="BFC5C0"/>
+            </w:tcBorders>
+            <w:shd w:val="clear" w:color="auto" w:fill="FFFFFF"/>
+            <w:tcMar>
+              <w:top w:w="60" w:type="dxa"/>
+              <w:left w:w="100" w:type="dxa"/>
+              <w:bottom w:w="60" w:type="dxa"/>
+              <w:right w:w="100" w:type="dxa"/>
+            </w:tcMar>
+          </w:tcPr>
+          <w:p>
+            <w:pPr>
+              <w:rPr>
+                <w:sz w:val="18"/>
+                <w:szCs w:val="18"/>
+              </w:rPr>
+            </w:pPr>
+            <w:r>
+              <w:rPr>
+                <w:color w:val="1B241F"/>
+                <w:sz w:val="18"/>
+                <w:szCs w:val="18"/>
+              </w:rPr>
+              <w:t xml:space="preserve">Add files via upload (Requerimientos funcionales y no funcionales)</w:t>
+            </w:r>
+          </w:p>
+        </w:tc>
+      </w:tr>
+      <w:tr>
+        <w:tc>
+          <w:tcPr>
+            <w:tcW w:w="1100" w:type="dxa"/>
+            <w:tcBorders>
+              <w:top w:val="single" w:sz="4" w:space="0" w:color="BFC5C0"/>
+              <w:left w:val="single" w:sz="4" w:space="0" w:color="BFC5C0"/>
+              <w:bottom w:val="single" w:sz="4" w:space="0" w:color="BFC5C0"/>
+              <w:right w:val="single" w:sz="4" w:space="0" w:color="BFC5C0"/>
+            </w:tcBorders>
+            <w:shd w:val="clear" w:color="auto" w:fill="FFFFFF"/>
+            <w:tcMar>
+              <w:top w:w="60" w:type="dxa"/>
+              <w:left w:w="100" w:type="dxa"/>
+              <w:bottom w:w="60" w:type="dxa"/>
+              <w:right w:w="100" w:type="dxa"/>
+            </w:tcMar>
+          </w:tcPr>
+          <w:p>
+            <w:pPr>
+              <w:rPr>
+                <w:sz w:val="18"/>
+                <w:szCs w:val="18"/>
+              </w:rPr>
+            </w:pPr>
+            <w:r>
+              <w:rPr>
+                <w:color w:val="1B241F"/>
+                <w:sz w:val="18"/>
+                <w:szCs w:val="18"/>
+              </w:rPr>
+              <w:t xml:space="preserve">df725d8</w:t>
+            </w:r>
+          </w:p>
+        </w:tc>
+        <w:tc>
+          <w:tcPr>
+            <w:tcW w:w="2400" w:type="dxa"/>
+            <w:tcBorders>
+              <w:top w:val="single" w:sz="4" w:space="0" w:color="BFC5C0"/>
+              <w:left w:val="single" w:sz="4" w:space="0" w:color="BFC5C0"/>
+              <w:bottom w:val="single" w:sz="4" w:space="0" w:color="BFC5C0"/>
+              <w:right w:val="single" w:sz="4" w:space="0" w:color="BFC5C0"/>
+            </w:tcBorders>
+            <w:shd w:val="clear" w:color="auto" w:fill="FFFFFF"/>
+            <w:tcMar>
+              <w:top w:w="60" w:type="dxa"/>
+              <w:left w:w="100" w:type="dxa"/>
+              <w:bottom w:w="60" w:type="dxa"/>
+              <w:right w:w="100" w:type="dxa"/>
+            </w:tcMar>
+          </w:tcPr>
+          <w:p>
+            <w:pPr>
+              <w:rPr>
+                <w:sz w:val="18"/>
+                <w:szCs w:val="18"/>
+              </w:rPr>
+            </w:pPr>
+            <w:r>
+              <w:rPr>
+                <w:color w:val="1B241F"/>
+                <w:sz w:val="18"/>
+                <w:szCs w:val="18"/>
+              </w:rPr>
+              <w:t xml:space="preserve">María José Cedillo (mariacedillom-tech)</w:t>
+            </w:r>
+          </w:p>
+        </w:tc>
+        <w:tc>
+          <w:tcPr>
+            <w:tcW w:w="1000" w:type="dxa"/>
+            <w:tcBorders>
+              <w:top w:val="single" w:sz="4" w:space="0" w:color="BFC5C0"/>
+              <w:left w:val="single" w:sz="4" w:space="0" w:color="BFC5C0"/>
+              <w:bottom w:val="single" w:sz="4" w:space="0" w:color="BFC5C0"/>
+              <w:right w:val="single" w:sz="4" w:space="0" w:color="BFC5C0"/>
+            </w:tcBorders>
+            <w:shd w:val="clear" w:color="auto" w:fill="FFFFFF"/>
+            <w:tcMar>
+              <w:top w:w="60" w:type="dxa"/>
+              <w:left w:w="100" w:type="dxa"/>
+              <w:bottom w:w="60" w:type="dxa"/>
+              <w:right w:w="100" w:type="dxa"/>
+            </w:tcMar>
+          </w:tcPr>
+          <w:p>
+            <w:pPr>
+              <w:rPr>
+                <w:sz w:val="18"/>
+                <w:szCs w:val="18"/>
+              </w:rPr>
+            </w:pPr>
+            <w:r>
+              <w:rPr>
+                <w:color w:val="1B241F"/>
+                <w:sz w:val="18"/>
+                <w:szCs w:val="18"/>
+              </w:rPr>
+              <w:t xml:space="preserve">01-sep</w:t>
+            </w:r>
+          </w:p>
+        </w:tc>
+        <w:tc>
+          <w:tcPr>
+            <w:tcW w:w="4860" w:type="dxa"/>
+            <w:tcBorders>
+              <w:top w:val="single" w:sz="4" w:space="0" w:color="BFC5C0"/>
+              <w:left w:val="single" w:sz="4" w:space="0" w:color="BFC5C0"/>
+              <w:bottom w:val="single" w:sz="4" w:space="0" w:color="BFC5C0"/>
+              <w:right w:val="single" w:sz="4" w:space="0" w:color="BFC5C0"/>
+            </w:tcBorders>
+            <w:shd w:val="clear" w:color="auto" w:fill="FFFFFF"/>
+            <w:tcMar>
+              <w:top w:w="60" w:type="dxa"/>
+              <w:left w:w="100" w:type="dxa"/>
+              <w:bottom w:w="60" w:type="dxa"/>
+              <w:right w:w="100" w:type="dxa"/>
+            </w:tcMar>
+          </w:tcPr>
+          <w:p>
+            <w:pPr>
+              <w:rPr>
+                <w:sz w:val="18"/>
+                <w:szCs w:val="18"/>
+              </w:rPr>
+            </w:pPr>
+            <w:r>
+              <w:rPr>
+                <w:color w:val="1B241F"/>
+                <w:sz w:val="18"/>
+                <w:szCs w:val="18"/>
+              </w:rPr>
+              <w:t xml:space="preserve">Add files via upload (Flujo del pedido y reglas de negocio)</w:t>
+            </w:r>
+          </w:p>
+        </w:tc>
+      </w:tr>
+      <w:tr>
+        <w:tc>
+          <w:tcPr>
+            <w:tcW w:w="1100" w:type="dxa"/>
+            <w:tcBorders>
+              <w:top w:val="single" w:sz="4" w:space="0" w:color="BFC5C0"/>
+              <w:left w:val="single" w:sz="4" w:space="0" w:color="BFC5C0"/>
+              <w:bottom w:val="single" w:sz="4" w:space="0" w:color="BFC5C0"/>
+              <w:right w:val="single" w:sz="4" w:space="0" w:color="BFC5C0"/>
+            </w:tcBorders>
+            <w:shd w:val="clear" w:color="auto" w:fill="FFFFFF"/>
+            <w:tcMar>
+              <w:top w:w="60" w:type="dxa"/>
+              <w:left w:w="100" w:type="dxa"/>
+              <w:bottom w:w="60" w:type="dxa"/>
+              <w:right w:w="100" w:type="dxa"/>
+            </w:tcMar>
+          </w:tcPr>
+          <w:p>
+            <w:pPr>
+              <w:rPr>
+                <w:sz w:val="18"/>
+                <w:szCs w:val="18"/>
+              </w:rPr>
+            </w:pPr>
+            <w:r>
+              <w:rPr>
+                <w:color w:val="1B241F"/>
+                <w:sz w:val="18"/>
+                <w:szCs w:val="18"/>
+              </w:rPr>
+              <w:t xml:space="preserve">84df5fe</w:t>
+            </w:r>
+          </w:p>
+        </w:tc>
+        <w:tc>
+          <w:tcPr>
+            <w:tcW w:w="2400" w:type="dxa"/>
+            <w:tcBorders>
+              <w:top w:val="single" w:sz="4" w:space="0" w:color="BFC5C0"/>
+              <w:left w:val="single" w:sz="4" w:space="0" w:color="BFC5C0"/>
+              <w:bottom w:val="single" w:sz="4" w:space="0" w:color="BFC5C0"/>
+              <w:right w:val="single" w:sz="4" w:space="0" w:color="BFC5C0"/>
+            </w:tcBorders>
+            <w:shd w:val="clear" w:color="auto" w:fill="FFFFFF"/>
+            <w:tcMar>
+              <w:top w:w="60" w:type="dxa"/>
+              <w:left w:w="100" w:type="dxa"/>
+              <w:bottom w:w="60" w:type="dxa"/>
+              <w:right w:w="100" w:type="dxa"/>
+            </w:tcMar>
+          </w:tcPr>
+          <w:p>
+            <w:pPr>
+              <w:rPr>
+                <w:sz w:val="18"/>
+                <w:szCs w:val="18"/>
+              </w:rPr>
+            </w:pPr>
+            <w:r>
+              <w:rPr>
+                <w:color w:val="1B241F"/>
+                <w:sz w:val="18"/>
+                <w:szCs w:val="18"/>
+              </w:rPr>
+              <w:t xml:space="preserve">María José Cedillo (mariacedillom-tech)</w:t>
+            </w:r>
+          </w:p>
+        </w:tc>
+        <w:tc>
+          <w:tcPr>
+            <w:tcW w:w="1000" w:type="dxa"/>
+            <w:tcBorders>
+              <w:top w:val="single" w:sz="4" w:space="0" w:color="BFC5C0"/>
+              <w:left w:val="single" w:sz="4" w:space="0" w:color="BFC5C0"/>
+              <w:bottom w:val="single" w:sz="4" w:space="0" w:color="BFC5C0"/>
+              <w:right w:val="single" w:sz="4" w:space="0" w:color="BFC5C0"/>
+            </w:tcBorders>
+            <w:shd w:val="clear" w:color="auto" w:fill="FFFFFF"/>
+            <w:tcMar>
+              <w:top w:w="60" w:type="dxa"/>
+              <w:left w:w="100" w:type="dxa"/>
+              <w:bottom w:w="60" w:type="dxa"/>
+              <w:right w:w="100" w:type="dxa"/>
+            </w:tcMar>
+          </w:tcPr>
+          <w:p>
+            <w:pPr>
+              <w:rPr>
+                <w:sz w:val="18"/>
+                <w:szCs w:val="18"/>
+              </w:rPr>
+            </w:pPr>
+            <w:r>
+              <w:rPr>
+                <w:color w:val="1B241F"/>
+                <w:sz w:val="18"/>
+                <w:szCs w:val="18"/>
+              </w:rPr>
+              <w:t xml:space="preserve">01-sep</w:t>
+            </w:r>
+          </w:p>
+        </w:tc>
+        <w:tc>
+          <w:tcPr>
+            <w:tcW w:w="4860" w:type="dxa"/>
+            <w:tcBorders>
+              <w:top w:val="single" w:sz="4" w:space="0" w:color="BFC5C0"/>
+              <w:left w:val="single" w:sz="4" w:space="0" w:color="BFC5C0"/>
+              <w:bottom w:val="single" w:sz="4" w:space="0" w:color="BFC5C0"/>
+              <w:right w:val="single" w:sz="4" w:space="0" w:color="BFC5C0"/>
+            </w:tcBorders>
+            <w:shd w:val="clear" w:color="auto" w:fill="FFFFFF"/>
+            <w:tcMar>
+              <w:top w:w="60" w:type="dxa"/>
+              <w:left w:w="100" w:type="dxa"/>
+              <w:bottom w:w="60" w:type="dxa"/>
+              <w:right w:w="100" w:type="dxa"/>
+            </w:tcMar>
+          </w:tcPr>
+          <w:p>
+            <w:pPr>
+              <w:rPr>
+                <w:sz w:val="18"/>
+                <w:szCs w:val="18"/>
+              </w:rPr>
+            </w:pPr>
+            <w:r>
+              <w:rPr>
+                <w:color w:val="1B241F"/>
+                <w:sz w:val="18"/>
+                <w:szCs w:val="18"/>
+              </w:rPr>
+              <w:t xml:space="preserve">Add files via upload (Historias de usuario y criterios de aceptación)</w:t>
+            </w:r>
+          </w:p>
+        </w:tc>
+      </w:tr>
+      <w:tr>
+        <w:tc>
+          <w:tcPr>
+            <w:tcW w:w="1100" w:type="dxa"/>
+            <w:tcBorders>
+              <w:top w:val="single" w:sz="4" w:space="0" w:color="BFC5C0"/>
+              <w:left w:val="single" w:sz="4" w:space="0" w:color="BFC5C0"/>
+              <w:bottom w:val="single" w:sz="4" w:space="0" w:color="BFC5C0"/>
+              <w:right w:val="single" w:sz="4" w:space="0" w:color="BFC5C0"/>
+            </w:tcBorders>
+            <w:shd w:val="clear" w:color="auto" w:fill="FFFFFF"/>
+            <w:tcMar>
+              <w:top w:w="60" w:type="dxa"/>
+              <w:left w:w="100" w:type="dxa"/>
+              <w:bottom w:w="60" w:type="dxa"/>
+              <w:right w:w="100" w:type="dxa"/>
+            </w:tcMar>
+          </w:tcPr>
+          <w:p>
+            <w:pPr>
+              <w:rPr>
+                <w:sz w:val="18"/>
+                <w:szCs w:val="18"/>
+              </w:rPr>
+            </w:pPr>
+            <w:r>
+              <w:rPr>
+                <w:color w:val="1B241F"/>
+                <w:sz w:val="18"/>
+                <w:szCs w:val="18"/>
+              </w:rPr>
+              <w:t xml:space="preserve">d7d89af</w:t>
+            </w:r>
+          </w:p>
+        </w:tc>
+        <w:tc>
+          <w:tcPr>
+            <w:tcW w:w="2400" w:type="dxa"/>
+            <w:tcBorders>
+              <w:top w:val="single" w:sz="4" w:space="0" w:color="BFC5C0"/>
+              <w:left w:val="single" w:sz="4" w:space="0" w:color="BFC5C0"/>
+              <w:bottom w:val="single" w:sz="4" w:space="0" w:color="BFC5C0"/>
+              <w:right w:val="single" w:sz="4" w:space="0" w:color="BFC5C0"/>
+            </w:tcBorders>
+            <w:shd w:val="clear" w:color="auto" w:fill="FFFFFF"/>
+            <w:tcMar>
+              <w:top w:w="60" w:type="dxa"/>
+              <w:left w:w="100" w:type="dxa"/>
+              <w:bottom w:w="60" w:type="dxa"/>
+              <w:right w:w="100" w:type="dxa"/>
+            </w:tcMar>
+          </w:tcPr>
+          <w:p>
+            <w:pPr>
+              <w:rPr>
+                <w:sz w:val="18"/>
+                <w:szCs w:val="18"/>
+              </w:rPr>
+            </w:pPr>
+            <w:r>
+              <w:rPr>
+                <w:color w:val="1B241F"/>
+                <w:sz w:val="18"/>
+                <w:szCs w:val="18"/>
+              </w:rPr>
+              <w:t xml:space="preserve">María José Cedillo (mariacedillom-tech)</w:t>
+            </w:r>
+          </w:p>
+        </w:tc>
+        <w:tc>
+          <w:tcPr>
+            <w:tcW w:w="1000" w:type="dxa"/>
+            <w:tcBorders>
+              <w:top w:val="single" w:sz="4" w:space="0" w:color="BFC5C0"/>
+              <w:left w:val="single" w:sz="4" w:space="0" w:color="BFC5C0"/>
+              <w:bottom w:val="single" w:sz="4" w:space="0" w:color="BFC5C0"/>
+              <w:right w:val="single" w:sz="4" w:space="0" w:color="BFC5C0"/>
+            </w:tcBorders>
+            <w:shd w:val="clear" w:color="auto" w:fill="FFFFFF"/>
+            <w:tcMar>
+              <w:top w:w="60" w:type="dxa"/>
+              <w:left w:w="100" w:type="dxa"/>
+              <w:bottom w:w="60" w:type="dxa"/>
+              <w:right w:w="100" w:type="dxa"/>
+            </w:tcMar>
+          </w:tcPr>
+          <w:p>
+            <w:pPr>
+              <w:rPr>
+                <w:sz w:val="18"/>
+                <w:szCs w:val="18"/>
+              </w:rPr>
+            </w:pPr>
+            <w:r>
+              <w:rPr>
+                <w:color w:val="1B241F"/>
+                <w:sz w:val="18"/>
+                <w:szCs w:val="18"/>
+              </w:rPr>
+              <w:t xml:space="preserve">01-sep</w:t>
+            </w:r>
+          </w:p>
+        </w:tc>
+        <w:tc>
+          <w:tcPr>
+            <w:tcW w:w="4860" w:type="dxa"/>
+            <w:tcBorders>
+              <w:top w:val="single" w:sz="4" w:space="0" w:color="BFC5C0"/>
+              <w:left w:val="single" w:sz="4" w:space="0" w:color="BFC5C0"/>
+              <w:bottom w:val="single" w:sz="4" w:space="0" w:color="BFC5C0"/>
+              <w:right w:val="single" w:sz="4" w:space="0" w:color="BFC5C0"/>
+            </w:tcBorders>
+            <w:shd w:val="clear" w:color="auto" w:fill="FFFFFF"/>
+            <w:tcMar>
+              <w:top w:w="60" w:type="dxa"/>
+              <w:left w:w="100" w:type="dxa"/>
+              <w:bottom w:w="60" w:type="dxa"/>
+              <w:right w:w="100" w:type="dxa"/>
+            </w:tcMar>
+          </w:tcPr>
+          <w:p>
+            <w:pPr>
+              <w:rPr>
+                <w:sz w:val="18"/>
+                <w:szCs w:val="18"/>
+              </w:rPr>
+            </w:pPr>
+            <w:r>
+              <w:rPr>
+                <w:color w:val="1B241F"/>
+                <w:sz w:val="18"/>
+                <w:szCs w:val="18"/>
+              </w:rPr>
+              <w:t xml:space="preserve">Add files via upload (Casos de uso principales)</w:t>
+            </w:r>
+          </w:p>
+        </w:tc>
+      </w:tr>
+      <w:tr>
+        <w:tc>
+          <w:tcPr>
+            <w:tcW w:w="1100" w:type="dxa"/>
+            <w:tcBorders>
+              <w:top w:val="single" w:sz="4" w:space="0" w:color="BFC5C0"/>
+              <w:left w:val="single" w:sz="4" w:space="0" w:color="BFC5C0"/>
+              <w:bottom w:val="single" w:sz="4" w:space="0" w:color="BFC5C0"/>
+              <w:right w:val="single" w:sz="4" w:space="0" w:color="BFC5C0"/>
+            </w:tcBorders>
+            <w:shd w:val="clear" w:color="auto" w:fill="FFFFFF"/>
+            <w:tcMar>
+              <w:top w:w="60" w:type="dxa"/>
+              <w:left w:w="100" w:type="dxa"/>
+              <w:bottom w:w="60" w:type="dxa"/>
+              <w:right w:w="100" w:type="dxa"/>
+            </w:tcMar>
+          </w:tcPr>
+          <w:p>
+            <w:pPr>
+              <w:rPr>
+                <w:sz w:val="18"/>
+                <w:szCs w:val="18"/>
+              </w:rPr>
+            </w:pPr>
+            <w:r>
+              <w:rPr>
+                <w:color w:val="1B241F"/>
+                <w:sz w:val="18"/>
+                <w:szCs w:val="18"/>
+              </w:rPr>
+              <w:t xml:space="preserve">be6b255</w:t>
+            </w:r>
+          </w:p>
+        </w:tc>
+        <w:tc>
+          <w:tcPr>
+            <w:tcW w:w="2400" w:type="dxa"/>
+            <w:tcBorders>
+              <w:top w:val="single" w:sz="4" w:space="0" w:color="BFC5C0"/>
+              <w:left w:val="single" w:sz="4" w:space="0" w:color="BFC5C0"/>
+              <w:bottom w:val="single" w:sz="4" w:space="0" w:color="BFC5C0"/>
+              <w:right w:val="single" w:sz="4" w:space="0" w:color="BFC5C0"/>
+            </w:tcBorders>
+            <w:shd w:val="clear" w:color="auto" w:fill="FFFFFF"/>
+            <w:tcMar>
+              <w:top w:w="60" w:type="dxa"/>
+              <w:left w:w="100" w:type="dxa"/>
+              <w:bottom w:w="60" w:type="dxa"/>
+              <w:right w:w="100" w:type="dxa"/>
+            </w:tcMar>
+          </w:tcPr>
+          <w:p>
+            <w:pPr>
+              <w:rPr>
+                <w:sz w:val="18"/>
+                <w:szCs w:val="18"/>
+              </w:rPr>
+            </w:pPr>
+            <w:r>
+              <w:rPr>
+                <w:color w:val="1B241F"/>
+                <w:sz w:val="18"/>
+                <w:szCs w:val="18"/>
+              </w:rPr>
+              <w:t xml:space="preserve">María José Cedillo (mariacedillom-tech)</w:t>
+            </w:r>
+          </w:p>
+        </w:tc>
+        <w:tc>
+          <w:tcPr>
+            <w:tcW w:w="1000" w:type="dxa"/>
+            <w:tcBorders>
+              <w:top w:val="single" w:sz="4" w:space="0" w:color="BFC5C0"/>
+              <w:left w:val="single" w:sz="4" w:space="0" w:color="BFC5C0"/>
+              <w:bottom w:val="single" w:sz="4" w:space="0" w:color="BFC5C0"/>
+              <w:right w:val="single" w:sz="4" w:space="0" w:color="BFC5C0"/>
+            </w:tcBorders>
+            <w:shd w:val="clear" w:color="auto" w:fill="FFFFFF"/>
+            <w:tcMar>
+              <w:top w:w="60" w:type="dxa"/>
+              <w:left w:w="100" w:type="dxa"/>
+              <w:bottom w:w="60" w:type="dxa"/>
+              <w:right w:w="100" w:type="dxa"/>
+            </w:tcMar>
+          </w:tcPr>
+          <w:p>
+            <w:pPr>
+              <w:rPr>
+                <w:sz w:val="18"/>
+                <w:szCs w:val="18"/>
+              </w:rPr>
+            </w:pPr>
+            <w:r>
+              <w:rPr>
+                <w:color w:val="1B241F"/>
+                <w:sz w:val="18"/>
+                <w:szCs w:val="18"/>
+              </w:rPr>
+              <w:t xml:space="preserve">01-sep</w:t>
+            </w:r>
+          </w:p>
+        </w:tc>
+        <w:tc>
+          <w:tcPr>
+            <w:tcW w:w="4860" w:type="dxa"/>
+            <w:tcBorders>
+              <w:top w:val="single" w:sz="4" w:space="0" w:color="BFC5C0"/>
+              <w:left w:val="single" w:sz="4" w:space="0" w:color="BFC5C0"/>
+              <w:bottom w:val="single" w:sz="4" w:space="0" w:color="BFC5C0"/>
+              <w:right w:val="single" w:sz="4" w:space="0" w:color="BFC5C0"/>
+            </w:tcBorders>
+            <w:shd w:val="clear" w:color="auto" w:fill="FFFFFF"/>
+            <w:tcMar>
+              <w:top w:w="60" w:type="dxa"/>
+              <w:left w:w="100" w:type="dxa"/>
+              <w:bottom w:w="60" w:type="dxa"/>
+              <w:right w:w="100" w:type="dxa"/>
+            </w:tcMar>
+          </w:tcPr>
+          <w:p>
+            <w:pPr>
+              <w:rPr>
+                <w:sz w:val="18"/>
+                <w:szCs w:val="18"/>
+              </w:rPr>
+            </w:pPr>
+            <w:r>
+              <w:rPr>
+                <w:color w:val="1B241F"/>
+                <w:sz w:val="18"/>
+                <w:szCs w:val="18"/>
+              </w:rPr>
+              <w:t xml:space="preserve">Add files via upload (Matriz de trazabilidad)</w:t>
+            </w:r>
+          </w:p>
+        </w:tc>
+      </w:tr>
+      <w:tr>
+        <w:tc>
+          <w:tcPr>
+            <w:tcW w:w="1100" w:type="dxa"/>
+            <w:tcBorders>
+              <w:top w:val="single" w:sz="4" w:space="0" w:color="BFC5C0"/>
+              <w:left w:val="single" w:sz="4" w:space="0" w:color="BFC5C0"/>
+              <w:bottom w:val="single" w:sz="4" w:space="0" w:color="BFC5C0"/>
+              <w:right w:val="single" w:sz="4" w:space="0" w:color="BFC5C0"/>
+            </w:tcBorders>
+            <w:shd w:val="clear" w:color="auto" w:fill="FFFFFF"/>
+            <w:tcMar>
+              <w:top w:w="60" w:type="dxa"/>
+              <w:left w:w="100" w:type="dxa"/>
+              <w:bottom w:w="60" w:type="dxa"/>
+              <w:right w:w="100" w:type="dxa"/>
+            </w:tcMar>
+          </w:tcPr>
+          <w:p>
+            <w:pPr>
+              <w:rPr>
+                <w:sz w:val="18"/>
+                <w:szCs w:val="18"/>
+              </w:rPr>
+            </w:pPr>
+            <w:r>
+              <w:rPr>
+                <w:color w:val="1B241F"/>
+                <w:sz w:val="18"/>
+                <w:szCs w:val="18"/>
+              </w:rPr>
               <w:t>c8f2beb</w:t>
             </w:r>
           </w:p>
@@ -25289,17 +26136,9 @@
                 <w:sz w:val="18"/>
                 <w:szCs w:val="18"/>
               </w:rPr>
-              <w:t>mauro-</w:t>
+              <w:t xml:space="preserve">Mauro Castillo (mauro-castp)</w:t>
             </w:r>
             <w:proofErr w:type="spellStart"/>
-            <w:r>
-              <w:rPr>
-                <w:color w:val="1B241F"/>
-                <w:sz w:val="18"/>
-                <w:szCs w:val="18"/>
-              </w:rPr>
-              <w:t>castp</w:t>
-            </w:r>
             <w:proofErr w:type="spellEnd"/>
           </w:p>
         </w:tc>
@@ -25396,6 +26235,9 @@
         <w:tc>
           <w:tcPr>
             <w:tcW w:w="1100" w:type="dxa"/>
+            <w:tcBorders>
+              <w:bottom w:val="single" w:sz="4" w:space="0" w:color="auto"/>
+            </w:tcBorders>
           </w:tcPr>
           <w:p>
             <w:pPr>
@@ -25409,13 +26251,16 @@
                 <w:sz w:val="18"/>
                 <w:szCs w:val="18"/>
               </w:rPr>
-              <w:t>73a4898</w:t>
+              <w:t xml:space="preserve">1458efd</w:t>
             </w:r>
           </w:p>
         </w:tc>
         <w:tc>
           <w:tcPr>
             <w:tcW w:w="2400" w:type="dxa"/>
+            <w:tcBorders>
+              <w:bottom w:val="single" w:sz="4" w:space="0" w:color="auto"/>
+            </w:tcBorders>
           </w:tcPr>
           <w:p>
             <w:pPr>
@@ -25430,7 +26275,7 @@
                 <w:sz w:val="18"/>
                 <w:szCs w:val="18"/>
               </w:rPr>
-              <w:t>lizsoriano</w:t>
+              <w:t xml:space="preserve">Vanessa Morante (vanessamorante-lgtm)</w:t>
             </w:r>
             <w:proofErr w:type="spellEnd"/>
           </w:p>
@@ -25438,6 +26283,9 @@
         <w:tc>
           <w:tcPr>
             <w:tcW w:w="1000" w:type="dxa"/>
+            <w:tcBorders>
+              <w:bottom w:val="single" w:sz="4" w:space="0" w:color="auto"/>
+            </w:tcBorders>
           </w:tcPr>
           <w:p>
             <w:pPr>
@@ -25451,36 +26299,36 @@
                 <w:sz w:val="18"/>
                 <w:szCs w:val="18"/>
               </w:rPr>
-              <w:t>29-sep</w:t>
+              <w:t xml:space="preserve">29-sep</w:t>
             </w:r>
           </w:p>
         </w:tc>
         <w:tc>
           <w:tcPr>
             <w:tcW w:w="4860" w:type="dxa"/>
+            <w:tcBorders>
+              <w:bottom w:val="single" w:sz="4" w:space="0" w:color="auto"/>
+            </w:tcBorders>
           </w:tcPr>
           <w:p>
             <w:pPr>
               <w:rPr>
                 <w:sz w:val="18"/>
                 <w:szCs w:val="18"/>
+                <w:lang w:val="en-US"/>
               </w:rPr>
             </w:pPr>
             <w:r>
               <w:rPr>
                 <w:sz w:val="18"/>
                 <w:szCs w:val="18"/>
-              </w:rPr>
-              <w:t xml:space="preserve">Agregar módulo de Planeación y viabilidad de </w:t>
+                <w:lang w:val="en-US"/>
+              </w:rPr>
+              <w:t xml:space="preserve">Add files via upload (documento de arquitectura)</w:t>
             </w:r>
             <w:proofErr w:type="spellStart"/>
-            <w:r>
-              <w:rPr>
-                <w:sz w:val="18"/>
-                <w:szCs w:val="18"/>
-              </w:rPr>
-              <w:t>microhubs</w:t>
-            </w:r>
+            <w:proofErr w:type="spellEnd"/>
+            <w:proofErr w:type="spellStart"/>
             <w:proofErr w:type="spellEnd"/>
           </w:p>
         </w:tc>
@@ -25489,9 +26337,6 @@
         <w:tc>
           <w:tcPr>
             <w:tcW w:w="1100" w:type="dxa"/>
-            <w:tcBorders>
-              <w:bottom w:val="single" w:sz="4" w:space="0" w:color="auto"/>
-            </w:tcBorders>
           </w:tcPr>
           <w:p>
             <w:pPr>
@@ -25505,16 +26350,13 @@
                 <w:sz w:val="18"/>
                 <w:szCs w:val="18"/>
               </w:rPr>
-              <w:t>a3befb8</w:t>
+              <w:t>73a4898</w:t>
             </w:r>
           </w:p>
         </w:tc>
         <w:tc>
           <w:tcPr>
             <w:tcW w:w="2400" w:type="dxa"/>
-            <w:tcBorders>
-              <w:bottom w:val="single" w:sz="4" w:space="0" w:color="auto"/>
-            </w:tcBorders>
           </w:tcPr>
           <w:p>
             <w:pPr>
@@ -25529,7 +26371,7 @@
                 <w:sz w:val="18"/>
                 <w:szCs w:val="18"/>
               </w:rPr>
-              <w:t>lizsoriano</w:t>
+              <w:t xml:space="preserve">Ruth Soriano</w:t>
             </w:r>
             <w:proofErr w:type="spellEnd"/>
           </w:p>
@@ -25537,6 +26379,57 @@
         <w:tc>
           <w:tcPr>
             <w:tcW w:w="1000" w:type="dxa"/>
+          </w:tcPr>
+          <w:p>
+            <w:pPr>
+              <w:rPr>
+                <w:sz w:val="18"/>
+                <w:szCs w:val="18"/>
+              </w:rPr>
+            </w:pPr>
+            <w:r>
+              <w:rPr>
+                <w:sz w:val="18"/>
+                <w:szCs w:val="18"/>
+              </w:rPr>
+              <w:t>29-sep</w:t>
+            </w:r>
+          </w:p>
+        </w:tc>
+        <w:tc>
+          <w:tcPr>
+            <w:tcW w:w="4860" w:type="dxa"/>
+          </w:tcPr>
+          <w:p>
+            <w:pPr>
+              <w:rPr>
+                <w:sz w:val="18"/>
+                <w:szCs w:val="18"/>
+              </w:rPr>
+            </w:pPr>
+            <w:r>
+              <w:rPr>
+                <w:sz w:val="18"/>
+                <w:szCs w:val="18"/>
+              </w:rPr>
+              <w:t xml:space="preserve">Agregar módulo de Planeación y viabilidad de </w:t>
+            </w:r>
+            <w:proofErr w:type="spellStart"/>
+            <w:r>
+              <w:rPr>
+                <w:sz w:val="18"/>
+                <w:szCs w:val="18"/>
+              </w:rPr>
+              <w:t>microhubs</w:t>
+            </w:r>
+            <w:proofErr w:type="spellEnd"/>
+          </w:p>
+        </w:tc>
+      </w:tr>
+      <w:tr>
+        <w:tc>
+          <w:tcPr>
+            <w:tcW w:w="1100" w:type="dxa"/>
             <w:tcBorders>
               <w:bottom w:val="single" w:sz="4" w:space="0" w:color="auto"/>
             </w:tcBorders>
@@ -25553,6 +26446,54 @@
                 <w:sz w:val="18"/>
                 <w:szCs w:val="18"/>
               </w:rPr>
+              <w:t>a3befb8</w:t>
+            </w:r>
+          </w:p>
+        </w:tc>
+        <w:tc>
+          <w:tcPr>
+            <w:tcW w:w="2400" w:type="dxa"/>
+            <w:tcBorders>
+              <w:bottom w:val="single" w:sz="4" w:space="0" w:color="auto"/>
+            </w:tcBorders>
+          </w:tcPr>
+          <w:p>
+            <w:pPr>
+              <w:rPr>
+                <w:sz w:val="18"/>
+                <w:szCs w:val="18"/>
+              </w:rPr>
+            </w:pPr>
+            <w:proofErr w:type="spellStart"/>
+            <w:r>
+              <w:rPr>
+                <w:sz w:val="18"/>
+                <w:szCs w:val="18"/>
+              </w:rPr>
+              <w:t xml:space="preserve">Ruth Soriano</w:t>
+            </w:r>
+            <w:proofErr w:type="spellEnd"/>
+          </w:p>
+        </w:tc>
+        <w:tc>
+          <w:tcPr>
+            <w:tcW w:w="1000" w:type="dxa"/>
+            <w:tcBorders>
+              <w:bottom w:val="single" w:sz="4" w:space="0" w:color="auto"/>
+            </w:tcBorders>
+          </w:tcPr>
+          <w:p>
+            <w:pPr>
+              <w:rPr>
+                <w:sz w:val="18"/>
+                <w:szCs w:val="18"/>
+              </w:rPr>
+            </w:pPr>
+            <w:r>
+              <w:rPr>
+                <w:sz w:val="18"/>
+                <w:szCs w:val="18"/>
+              </w:rPr>
               <w:t>29-sep</w:t>
             </w:r>
           </w:p>
@@ -25607,6 +26548,210 @@
               </w:rPr>
               <w:t>planeacion-integrada</w:t>
             </w:r>
+            <w:proofErr w:type="spellEnd"/>
+          </w:p>
+        </w:tc>
+      </w:tr>
+      <w:tr>
+        <w:tc>
+          <w:tcPr>
+            <w:tcW w:w="1100" w:type="dxa"/>
+            <w:tcBorders>
+              <w:bottom w:val="single" w:sz="4" w:space="0" w:color="auto"/>
+            </w:tcBorders>
+          </w:tcPr>
+          <w:p>
+            <w:pPr>
+              <w:rPr>
+                <w:sz w:val="18"/>
+                <w:szCs w:val="18"/>
+              </w:rPr>
+            </w:pPr>
+            <w:r>
+              <w:rPr>
+                <w:sz w:val="18"/>
+                <w:szCs w:val="18"/>
+              </w:rPr>
+              <w:t xml:space="preserve">6200e77</w:t>
+            </w:r>
+          </w:p>
+        </w:tc>
+        <w:tc>
+          <w:tcPr>
+            <w:tcW w:w="2400" w:type="dxa"/>
+            <w:tcBorders>
+              <w:bottom w:val="single" w:sz="4" w:space="0" w:color="auto"/>
+            </w:tcBorders>
+          </w:tcPr>
+          <w:p>
+            <w:pPr>
+              <w:rPr>
+                <w:sz w:val="18"/>
+                <w:szCs w:val="18"/>
+              </w:rPr>
+            </w:pPr>
+            <w:proofErr w:type="spellStart"/>
+            <w:r>
+              <w:rPr>
+                <w:sz w:val="18"/>
+                <w:szCs w:val="18"/>
+              </w:rPr>
+              <w:t xml:space="preserve">Mauro Castillo (mauro-castp)</w:t>
+            </w:r>
+            <w:proofErr w:type="spellEnd"/>
+          </w:p>
+        </w:tc>
+        <w:tc>
+          <w:tcPr>
+            <w:tcW w:w="1000" w:type="dxa"/>
+            <w:tcBorders>
+              <w:bottom w:val="single" w:sz="4" w:space="0" w:color="auto"/>
+            </w:tcBorders>
+          </w:tcPr>
+          <w:p>
+            <w:pPr>
+              <w:rPr>
+                <w:sz w:val="18"/>
+                <w:szCs w:val="18"/>
+              </w:rPr>
+            </w:pPr>
+            <w:r>
+              <w:rPr>
+                <w:sz w:val="18"/>
+                <w:szCs w:val="18"/>
+              </w:rPr>
+              <w:t xml:space="preserve">29-sep</w:t>
+            </w:r>
+          </w:p>
+        </w:tc>
+        <w:tc>
+          <w:tcPr>
+            <w:tcW w:w="4860" w:type="dxa"/>
+            <w:tcBorders>
+              <w:bottom w:val="single" w:sz="4" w:space="0" w:color="auto"/>
+            </w:tcBorders>
+          </w:tcPr>
+          <w:p>
+            <w:pPr>
+              <w:rPr>
+                <w:sz w:val="18"/>
+                <w:szCs w:val="18"/>
+                <w:lang w:val="en-US"/>
+              </w:rPr>
+            </w:pPr>
+            <w:r>
+              <w:rPr>
+                <w:sz w:val="18"/>
+                <w:szCs w:val="18"/>
+                <w:lang w:val="en-US"/>
+              </w:rPr>
+              <w:t xml:space="preserve">Add files via upload (reporte técnico con diagramas)</w:t>
+            </w:r>
+            <w:proofErr w:type="spellStart"/>
+            <w:proofErr w:type="spellEnd"/>
+            <w:proofErr w:type="spellStart"/>
+            <w:proofErr w:type="spellEnd"/>
+          </w:p>
+        </w:tc>
+      </w:tr>
+      <w:tr>
+        <w:tc>
+          <w:tcPr>
+            <w:tcW w:w="1100" w:type="dxa"/>
+            <w:tcBorders>
+              <w:bottom w:val="single" w:sz="4" w:space="0" w:color="auto"/>
+            </w:tcBorders>
+          </w:tcPr>
+          <w:p>
+            <w:pPr>
+              <w:rPr>
+                <w:sz w:val="18"/>
+                <w:szCs w:val="18"/>
+              </w:rPr>
+            </w:pPr>
+            <w:r>
+              <w:rPr>
+                <w:sz w:val="18"/>
+                <w:szCs w:val="18"/>
+              </w:rPr>
+              <w:t xml:space="preserve">e09018a</w:t>
+            </w:r>
+          </w:p>
+        </w:tc>
+        <w:tc>
+          <w:tcPr>
+            <w:tcW w:w="2400" w:type="dxa"/>
+            <w:tcBorders>
+              <w:bottom w:val="single" w:sz="4" w:space="0" w:color="auto"/>
+            </w:tcBorders>
+          </w:tcPr>
+          <w:p>
+            <w:pPr>
+              <w:rPr>
+                <w:sz w:val="18"/>
+                <w:szCs w:val="18"/>
+              </w:rPr>
+            </w:pPr>
+            <w:proofErr w:type="spellStart"/>
+            <w:r>
+              <w:rPr>
+                <w:sz w:val="18"/>
+                <w:szCs w:val="18"/>
+              </w:rPr>
+              <w:t xml:space="preserve">Mauro Castillo (mauro-castp)</w:t>
+            </w:r>
+            <w:proofErr w:type="spellEnd"/>
+          </w:p>
+        </w:tc>
+        <w:tc>
+          <w:tcPr>
+            <w:tcW w:w="1000" w:type="dxa"/>
+            <w:tcBorders>
+              <w:bottom w:val="single" w:sz="4" w:space="0" w:color="auto"/>
+            </w:tcBorders>
+          </w:tcPr>
+          <w:p>
+            <w:pPr>
+              <w:rPr>
+                <w:sz w:val="18"/>
+                <w:szCs w:val="18"/>
+              </w:rPr>
+            </w:pPr>
+            <w:r>
+              <w:rPr>
+                <w:sz w:val="18"/>
+                <w:szCs w:val="18"/>
+              </w:rPr>
+              <w:t xml:space="preserve">29-sep</w:t>
+            </w:r>
+          </w:p>
+        </w:tc>
+        <w:tc>
+          <w:tcPr>
+            <w:tcW w:w="4860" w:type="dxa"/>
+            <w:tcBorders>
+              <w:bottom w:val="single" w:sz="4" w:space="0" w:color="auto"/>
+            </w:tcBorders>
+          </w:tcPr>
+          <w:p>
+            <w:pPr>
+              <w:rPr>
+                <w:sz w:val="18"/>
+                <w:szCs w:val="18"/>
+                <w:lang w:val="en-US"/>
+              </w:rPr>
+            </w:pPr>
+            <w:r>
+              <w:rPr>
+                <w:sz w:val="18"/>
+                <w:szCs w:val="18"/>
+                <w:lang w:val="en-US"/>
+              </w:rPr>
+              <w:t xml:space="preserve">Reporte Tecnico de Correciones Actualizado</w:t>
+            </w:r>
+            <w:proofErr w:type="spellStart"/>
+            <w:proofErr w:type="spellEnd"/>
+            <w:proofErr w:type="spellStart"/>
             <w:proofErr w:type="spellEnd"/>
           </w:p>
         </w:tc>
@@ -26435,7 +27580,7 @@
         <w:spacing w:after="120"/>
       </w:pPr>
       <w:r>
-        <w:t>Siguientes pasos inmediatos: (1) completar matrículas y participación; (2) capturar las pantallas nuevas; (3) actualizar los diagramas y las matrices de los bloques A y B; (4) confirmar profesor, materia y fecha exacta; (5) ejecutar la demostración final en el equipo del proyecto.</w:t>
+        <w:t xml:space="preserve">Siguientes pasos inmediatos: (1) actualizar las matrices de perfiles y de trazabilidad de los anexos con los requerimientos PL; (2) ejecutar la demostración final en el equipo del proyecto.</w:t>
       </w:r>
     </w:p>
     <w:p>

</xml_diff>